<commit_message>
latest update with nice results
</commit_message>
<xml_diff>
--- a/data/screening hitrates.docx
+++ b/data/screening hitrates.docx
@@ -3,17 +3,18 @@
 <w:document xmlns:wpc="http://schemas.microsoft.com/office/word/2010/wordprocessingCanvas" xmlns:cx="http://schemas.microsoft.com/office/drawing/2014/chartex" xmlns:cx1="http://schemas.microsoft.com/office/drawing/2015/9/8/chartex" xmlns:cx2="http://schemas.microsoft.com/office/drawing/2015/10/21/chartex" xmlns:cx3="http://schemas.microsoft.com/office/drawing/2016/5/9/chartex" xmlns:cx4="http://schemas.microsoft.com/office/drawing/2016/5/10/chartex" xmlns:cx5="http://schemas.microsoft.com/office/drawing/2016/5/11/chartex" xmlns:cx6="http://schemas.microsoft.com/office/drawing/2016/5/12/chartex" xmlns:cx7="http://schemas.microsoft.com/office/drawing/2016/5/13/chartex" xmlns:cx8="http://schemas.microsoft.com/office/drawing/2016/5/14/chartex" xmlns:mc="http://schemas.openxmlformats.org/markup-compatibility/2006" xmlns:aink="http://schemas.microsoft.com/office/drawing/2016/ink" xmlns:am3d="http://schemas.microsoft.com/office/drawing/2017/model3d" xmlns:o="urn:schemas-microsoft-com:office:office" xmlns:oel="http://schemas.microsoft.com/office/2019/extlst" xmlns:r="http://schemas.openxmlformats.org/officeDocument/2006/relationships" xmlns:m="http://schemas.openxmlformats.org/officeDocument/2006/math" xmlns:v="urn:schemas-microsoft-com:vml" xmlns:wp14="http://schemas.microsoft.com/office/word/2010/wordprocessingDrawing" xmlns:wp="http://schemas.openxmlformats.org/drawingml/2006/wordprocessingDrawing" xmlns:w10="urn:schemas-microsoft-com:office:word" xmlns:w="http://schemas.openxmlformats.org/wordprocessingml/2006/main" xmlns:w14="http://schemas.microsoft.com/office/word/2010/wordml" xmlns:w15="http://schemas.microsoft.com/office/word/2012/wordml" xmlns:w16cex="http://schemas.microsoft.com/office/word/2018/wordml/cex" xmlns:w16cid="http://schemas.microsoft.com/office/word/2016/wordml/cid" xmlns:w16="http://schemas.microsoft.com/office/word/2018/wordml" xmlns:w16du="http://schemas.microsoft.com/office/word/2023/wordml/word16du" xmlns:w16sdtdh="http://schemas.microsoft.com/office/word/2020/wordml/sdtdatahash" xmlns:w16sdtfl="http://schemas.microsoft.com/office/word/2024/wordml/sdtformatlock" xmlns:w16se="http://schemas.microsoft.com/office/word/2015/wordml/symex" xmlns:wpg="http://schemas.microsoft.com/office/word/2010/wordprocessingGroup" xmlns:wpi="http://schemas.microsoft.com/office/word/2010/wordprocessingInk" xmlns:wne="http://schemas.microsoft.com/office/word/2006/wordml" xmlns:wps="http://schemas.microsoft.com/office/word/2010/wordprocessingShape" mc:Ignorable="w14 w15 w16se w16cid w16 w16cex w16sdtdh w16sdtfl w16du wp14">
   <w:body>
     <w:p>
-      <w:r>
-        <w:t>Screening</w:t>
-      </w:r>
-      <w:r>
-        <w:t xml:space="preserve"> </w:t>
-      </w:r>
-      <w:r>
-        <w:t>hitrates</w:t>
-      </w:r>
-      <w:r>
-        <w:t>:</w:t>
+      <w:pPr>
+        <w:rPr>
+          <w:b/>
+          <w:bCs/>
+        </w:rPr>
+      </w:pPr>
+      <w:r>
+        <w:rPr>
+          <w:b/>
+          <w:bCs/>
+        </w:rPr>
+        <w:t>Screening hitrates:</w:t>
       </w:r>
     </w:p>
     <w:p>
@@ -29,85 +30,100 @@
     <w:p>
       <w:r>
         <w:t xml:space="preserve">Financial institutions must regularly check and adhere to sanctions lists issued by relevant authorities. </w:t>
-      </w:r>
-    </w:p>
-    <w:p>
-      <w:r>
-        <w:t xml:space="preserve">These lists include:  </w:t>
-      </w:r>
-    </w:p>
-    <w:p>
-      <w:r>
-        <w:t xml:space="preserve">OFAC List: The U.S. Department of the Treasury’s Office of Foreign Assets Control (OFAC) maintains this list of </w:t>
-      </w:r>
-    </w:p>
-    <w:p>
-      <w:r>
-        <w:t xml:space="preserve">individuals, entities, and countries subject to U.S. sanctions. </w:t>
-      </w:r>
-    </w:p>
-    <w:p>
-      <w:r>
-        <w:t xml:space="preserve">UN Sanctions List: The United Nations Security Council also issues </w:t>
-      </w:r>
-      <w:proofErr w:type="gramStart"/>
-      <w:r>
-        <w:t>lists</w:t>
-      </w:r>
-      <w:proofErr w:type="gramEnd"/>
-      <w:r>
-        <w:t xml:space="preserve"> of individuals and entities subject to </w:t>
-      </w:r>
-    </w:p>
-    <w:p>
-      <w:r>
-        <w:t xml:space="preserve">international sanctions. </w:t>
       </w:r>
     </w:p>
     <w:p/>
     <w:p>
-      <w:r>
-        <w:t xml:space="preserve">EU Sanctions List: The European Union maintains a list of sanctioned entities and individuals within its jurisdiction. </w:t>
+      <w:pPr>
+        <w:rPr>
+          <w:b/>
+          <w:bCs/>
+        </w:rPr>
+      </w:pPr>
+      <w:r>
+        <w:rPr>
+          <w:b/>
+          <w:bCs/>
+        </w:rPr>
+        <w:t xml:space="preserve">These lists include:  </w:t>
       </w:r>
     </w:p>
     <w:p>
       <w:r>
-        <w:t xml:space="preserve">Other National Lists: Other countries, like the UK (HM Treasury) or Canada (Global Affairs), also have their own </w:t>
+        <w:t xml:space="preserve">OFAC List: The U.S. Department of the Treasury’s Office of Foreign Assets Control (OFAC) maintains this list of </w:t>
       </w:r>
     </w:p>
     <w:p>
       <w:r>
-        <w:t xml:space="preserve">sanctions </w:t>
-      </w:r>
-      <w:proofErr w:type="gramStart"/>
-      <w:r>
-        <w:t>lists</w:t>
-      </w:r>
-      <w:proofErr w:type="gramEnd"/>
-      <w:r>
-        <w:t xml:space="preserve"> </w:t>
+        <w:t xml:space="preserve">individuals, entities, and countries subject to U.S. sanctions. </w:t>
       </w:r>
     </w:p>
     <w:p>
       <w:r>
-        <w:t xml:space="preserve">By adhering to sanctions compliance regulations, financial institutions mitigate the risk of inadvertently facilitating </w:t>
+        <w:t xml:space="preserve">UN Sanctions List: The United Nations Security Council also issues lists of individuals and entities subject to </w:t>
       </w:r>
     </w:p>
     <w:p>
       <w:r>
-        <w:t xml:space="preserve">prohibited transactions or dealing with sanctioned individuals and entities. Compliance not only helps to avoid legal and </w:t>
+        <w:t xml:space="preserve">international sanctions. </w:t>
+      </w:r>
+    </w:p>
+    <w:p/>
+    <w:p>
+      <w:pPr>
+        <w:rPr>
+          <w:b/>
+          <w:bCs/>
+        </w:rPr>
+      </w:pPr>
+      <w:r>
+        <w:rPr>
+          <w:b/>
+          <w:bCs/>
+        </w:rPr>
+        <w:t xml:space="preserve">EU Sanctions List: </w:t>
       </w:r>
     </w:p>
     <w:p>
       <w:r>
-        <w:t xml:space="preserve">financial penalties but also ensures that the institution operates with integrity and in line with international efforts to </w:t>
+        <w:t xml:space="preserve">The European Union maintains a list of sanctioned entities and individuals within its jurisdiction. </w:t>
       </w:r>
     </w:p>
     <w:p>
       <w:r>
+        <w:t xml:space="preserve">Other National Lists: Other countries, like the UK (HM Treasury) or Canada (Global Affairs), also have their own </w:t>
+      </w:r>
+    </w:p>
+    <w:p>
+      <w:r>
+        <w:t>sanctions lists</w:t>
+      </w:r>
+      <w:r>
+        <w:t>.</w:t>
+      </w:r>
+    </w:p>
+    <w:p/>
+    <w:p>
+      <w:r>
+        <w:t xml:space="preserve">By adhering to sanctions compliance regulations, financial institutions mitigate the risk of inadvertently facilitating </w:t>
+      </w:r>
+    </w:p>
+    <w:p>
+      <w:r>
+        <w:t xml:space="preserve">prohibited transactions or dealing with sanctioned individuals and entities. Compliance not only helps to avoid legal and </w:t>
+      </w:r>
+    </w:p>
+    <w:p>
+      <w:r>
+        <w:t xml:space="preserve">financial penalties but also ensures that the institution operates with integrity and in line with international efforts to </w:t>
+      </w:r>
+    </w:p>
+    <w:p>
+      <w:r>
         <w:t xml:space="preserve">prevent illegal or unethical activities. </w:t>
       </w:r>
     </w:p>
+    <w:p/>
     <w:p>
       <w:r>
         <w:t xml:space="preserve">In financial institutions automated screening systems are used to quickly and efficiently check transactions and parties </w:t>
@@ -135,50 +151,23 @@
         <w:t xml:space="preserve"> -</w:t>
       </w:r>
       <w:r>
-        <w:t xml:space="preserve">&gt; </w:t>
-      </w:r>
-      <w:proofErr w:type="spellStart"/>
-      <w:r>
-        <w:t>arithmos</w:t>
-      </w:r>
-      <w:proofErr w:type="spellEnd"/>
-      <w:r>
-        <w:t xml:space="preserve"> </w:t>
-      </w:r>
-      <w:proofErr w:type="spellStart"/>
-      <w:r>
-        <w:t>logariasmou</w:t>
-      </w:r>
-      <w:proofErr w:type="spellEnd"/>
-      <w:r>
-        <w:t xml:space="preserve"> </w:t>
-      </w:r>
-      <w:proofErr w:type="spellStart"/>
-      <w:r>
-        <w:t>trapezas</w:t>
-      </w:r>
-      <w:proofErr w:type="spellEnd"/>
-      <w:r>
-        <w:t xml:space="preserve"> e.g</w:t>
+        <w:t>&gt; arithmos logariasmou trapezas e.g</w:t>
       </w:r>
       <w:r>
         <w:t>.</w:t>
       </w:r>
       <w:r>
-        <w:t xml:space="preserve">, </w:t>
-      </w:r>
-      <w:proofErr w:type="spellStart"/>
-      <w:r>
-        <w:t>iban</w:t>
-      </w:r>
-      <w:proofErr w:type="spellEnd"/>
+        <w:t>, iban</w:t>
+      </w:r>
       <w:r>
         <w:t xml:space="preserve">, etc) with entries in sanctions lists.  </w:t>
       </w:r>
     </w:p>
     <w:p/>
+    <w:p/>
     <w:p>
       <w:r>
+        <w:lastRenderedPageBreak/>
         <w:t>The attached dataset refers to the hit rate of a combination set of sanctions</w:t>
       </w:r>
       <w:r>
@@ -189,86 +178,46 @@
           <w:b/>
           <w:bCs/>
         </w:rPr>
-        <w:t>(</w:t>
-      </w:r>
-      <w:proofErr w:type="spellStart"/>
-      <w:r>
+        <w:t>(kirwseis)</w:t>
+      </w:r>
+      <w:r>
+        <w:t xml:space="preserve"> lists (e.g. ListA) and corresponding transaction parties (e.g. field1) of an automated screening system. With this dataset we aim to identify the datapoints which are likely a drop anomaly (i.e. values which are below what is expected given the usual pattern of the data). </w:t>
+      </w:r>
+    </w:p>
+    <w:p>
+      <w:r>
+        <w:t xml:space="preserve">Considering that sanction lists versions are updated frequently, alerting about a drop anomaly has the potential to </w:t>
+      </w:r>
+    </w:p>
+    <w:p>
+      <w:r>
+        <w:t xml:space="preserve">indicate an irregularity in the screening system lists input content (e.g. ListA was updated incorrectly and its usual hit </w:t>
+      </w:r>
+    </w:p>
+    <w:p>
+      <w:r>
+        <w:t xml:space="preserve">rate level drops due to its usual content incompleteness). Failure in monitoring and identifying this system issue might </w:t>
+      </w:r>
+    </w:p>
+    <w:p>
+      <w:r>
+        <w:t xml:space="preserve">results in thousands of messages not being properly screened.     </w:t>
+      </w:r>
+    </w:p>
+    <w:p/>
+    <w:p>
+      <w:pPr>
         <w:rPr>
           <w:b/>
           <w:bCs/>
         </w:rPr>
-        <w:t>kirwseis</w:t>
-      </w:r>
-      <w:proofErr w:type="spellEnd"/>
+      </w:pPr>
       <w:r>
         <w:rPr>
           <w:b/>
           <w:bCs/>
         </w:rPr>
-        <w:t>)</w:t>
-      </w:r>
-      <w:r>
-        <w:t xml:space="preserve"> lists (e.g. </w:t>
-      </w:r>
-      <w:proofErr w:type="spellStart"/>
-      <w:r>
-        <w:t>ListA</w:t>
-      </w:r>
-      <w:proofErr w:type="spellEnd"/>
-      <w:r>
-        <w:t xml:space="preserve">) and corresponding </w:t>
-      </w:r>
-    </w:p>
-    <w:p>
-      <w:r>
-        <w:t xml:space="preserve">transaction parties (e.g. field1) of an automated screening system. With this dataset we aim to identify the datapoints </w:t>
-      </w:r>
-    </w:p>
-    <w:p>
-      <w:r>
-        <w:t xml:space="preserve">which are likely a drop anomaly (i.e. values which are below what is expected given the usual pattern of the data). </w:t>
-      </w:r>
-    </w:p>
-    <w:p>
-      <w:r>
-        <w:t xml:space="preserve">Considering that sanction lists versions are updated frequently, alerting about a drop anomaly has the potential to </w:t>
-      </w:r>
-    </w:p>
-    <w:p>
-      <w:r>
-        <w:t xml:space="preserve">indicate an irregularity in the screening system lists input content (e.g. </w:t>
-      </w:r>
-      <w:proofErr w:type="spellStart"/>
-      <w:r>
-        <w:t>ListA</w:t>
-      </w:r>
-      <w:proofErr w:type="spellEnd"/>
-      <w:r>
-        <w:t xml:space="preserve"> was updated incorrectly and its usual hit </w:t>
-      </w:r>
-    </w:p>
-    <w:p>
-      <w:r>
-        <w:lastRenderedPageBreak/>
-        <w:t xml:space="preserve">rate level drops due to its usual content incompleteness). Failure in monitoring and identifying this system issue might </w:t>
-      </w:r>
-    </w:p>
-    <w:p>
-      <w:r>
-        <w:t xml:space="preserve">results in thousands of messages not being properly screened.     </w:t>
-      </w:r>
-    </w:p>
-    <w:p>
-      <w:r>
-        <w:t xml:space="preserve">Notes: - - </w:t>
-      </w:r>
-      <w:proofErr w:type="gramStart"/>
-      <w:r>
-        <w:t>-  -</w:t>
-      </w:r>
-      <w:proofErr w:type="gramEnd"/>
-      <w:r>
-        <w:t xml:space="preserve"> </w:t>
+        <w:t xml:space="preserve">Notes: - - -  - </w:t>
       </w:r>
     </w:p>
     <w:p>

</xml_diff>